<commit_message>
Validate DOCX cell formula context and reuse data-row styling
</commit_message>
<xml_diff>
--- a/docs/DOCX table configurations and compatibility - PR 1876.docx
+++ b/docs/DOCX table configurations and compatibility - PR 1876.docx
@@ -31,7 +31,7 @@
         <w:pStyle w:val="SmallNote"/>
       </w:pPr>
       <w:r>
-        <w:t>3 October 2026  |  feathery-react  |  PR #1876</w:t>
+        <w:t>4 October 2026  |  feathery-react  |  PR #1876</w:t>
       </w:r>
     </w:p>
     <w:p>
@@ -2788,7 +2788,7 @@
         <w:t xml:space="preserve">Release status  </w:t>
       </w:r>
       <w:r>
-        <w:t>The corrected behavior described here exists on the local mirror branch. PR #1876 on GitHub still points to its older head and must receive these changes and pass CI before it can be deployed.</w:t>
+        <w:t>This guide describes the reviewed mirror branch. Confirm the PR head and passing CI checks before deployment; a successful local test run alone does not establish release readiness.</w:t>
       </w:r>
     </w:p>
     <w:p>
@@ -3172,7 +3172,7 @@
         <w:pStyle w:val="SmallNote"/>
       </w:pPr>
       <w:r>
-        <w:t>Comparison baseline 0b5bd0cb; local branch feat/docx-mirror-rows-adoption with review fixes, checked 3 October 2026.</w:t>
+        <w:t>Comparison baseline 0b5bd0cb; branch feat/docx-mirror-rows-adoption with review fixes, checked 4 October 2026.</w:t>
       </w:r>
     </w:p>
     <w:sectPr>
@@ -3195,7 +3195,7 @@
       <w:jc w:val="right"/>
     </w:pPr>
     <w:r>
-      <w:t xml:space="preserve">Working draft  •  3 Oct 2026  |  Page </w:t>
+      <w:t xml:space="preserve">Working draft  •  4 Oct 2026  |  Page </w:t>
     </w:r>
     <w:fldSimple w:instr="PAGE"/>
   </w:p>

</xml_diff>